<commit_message>
trim: drop React render-loop bullet and 'six-agent' red-team phrase
- Lilly experience: remove the 962-test-suite / OOM-killing-CI-runner bullet.
- vetlock summary + project bullet: remove the '31 of 35 exploits from a
  six-agent adversarial red-team review' phrase. The 'closed by v0.3.0'
  hardening claim is now implicit in '375 tests; caught 12 of 13 real
  historical npm attacks'.

Both regenerated artifacts committed alongside the source change.
</commit_message>
<xml_diff>
--- a/Uday_Ojha_Resume.docx
+++ b/Uday_Ojha_Resume.docx
@@ -32,7 +32,7 @@
         </w:rPr>
         <w:t xml:space="preserve">Chandigarh, India  |  +91 8360493330  |  </w:t>
       </w:r>
-      <w:hyperlink w:history="1" r:id="rIdy7g0yg-fdf5r4ulg9pr_f">
+      <w:hyperlink w:history="1" r:id="rId6phjlo4d1guc5cgb5tf3x">
         <w:r>
           <w:rPr>
             <w:rStyle w:val="Hyperlink"/>
@@ -49,7 +49,7 @@
         <w:spacing w:after="40"/>
         <w:jc w:val="center"/>
       </w:pPr>
-      <w:hyperlink w:history="1" r:id="rIdpx2_b0lhtseawr3qovs4y">
+      <w:hyperlink w:history="1" r:id="rIds0scpw2vspbsqi_8-mzjc">
         <w:r>
           <w:rPr>
             <w:rStyle w:val="Hyperlink"/>
@@ -68,7 +68,7 @@
         </w:rPr>
         <w:t xml:space="preserve">  |  </w:t>
       </w:r>
-      <w:hyperlink w:history="1" r:id="rId8ulf1hgepnazszlsa28ez">
+      <w:hyperlink w:history="1" r:id="rIdhif67khogfn0atoufr6dp">
         <w:r>
           <w:rPr>
             <w:rStyle w:val="Hyperlink"/>
@@ -87,7 +87,7 @@
         </w:rPr>
         <w:t xml:space="preserve">  |  </w:t>
       </w:r>
-      <w:hyperlink w:history="1" r:id="rId5ayjo2onqqffw4ctu6ugr">
+      <w:hyperlink w:history="1" r:id="rIdb2quxc8ojozc0zlpl5kvq">
         <w:r>
           <w:rPr>
             <w:rStyle w:val="Hyperlink"/>
@@ -129,7 +129,7 @@
           <w:sz w:val="20"/>
           <w:szCs w:val="20"/>
         </w:rPr>
-        <w:t xml:space="preserve">Software engineer (B.Tech CS ’26). At Eli Lilly, designed and shipped a production telemetry platform end-to-end — TypeScript browser SDK, Go + ClickHouse analytics backend, React dashboard, zero-touch Kubernetes/GitOps delivery. Independently authored vetlock, an open-source npm supply-chain scanner (17 detectors, 375 tests, 12/13 historical attacks caught, 31 red-team exploits closed) with a live browser demo on Cloudflare Workers + GitHub Actions. CTF reverse-engineering lead; two prior cybersecurity internships.</w:t>
+        <w:t xml:space="preserve">Software engineer (B.Tech CS ’26). At Eli Lilly, designed and shipped a production telemetry platform end-to-end — TypeScript browser SDK, Go + ClickHouse analytics backend, React dashboard, zero-touch Kubernetes/GitOps delivery. Independently authored vetlock, an open-source npm supply-chain scanner (17 detectors, 375 tests, 12/13 historical attacks caught) with a live browser demo on Cloudflare Workers + GitHub Actions. CTF reverse-engineering lead; two prior cybersecurity internships.</w:t>
       </w:r>
     </w:p>
     <w:p>
@@ -410,24 +410,6 @@
           <w:sz w:val="20"/>
           <w:szCs w:val="20"/>
         </w:rPr>
-        <w:t xml:space="preserve">Root-caused a React render loop that was OOM-killing CI runners — took a 962-test suite from 60+ min to 35 s; published the SDK to a private npm registry with semantic versioning and property-based tests.</w:t>
-      </w:r>
-    </w:p>
-    <w:p>
-      <w:pPr>
-        <w:pStyle w:val="ListParagraph"/>
-        <w:numPr>
-          <w:ilvl w:val="0"/>
-          <w:numId w:val="2"/>
-        </w:numPr>
-        <w:spacing w:after="10"/>
-      </w:pPr>
-      <w:r>
-        <w:rPr>
-          <w:rFonts w:ascii="Calibri" w:cs="Calibri" w:eastAsia="Calibri" w:hAnsi="Calibri"/>
-          <w:sz w:val="20"/>
-          <w:szCs w:val="20"/>
-        </w:rPr>
         <w:t xml:space="preserve">Worked in an AI-augmented workflow (LLM pair-programming, multi-agent orchestration), landing 25+ production pull requests across SDK, backend, and dashboard in the final two weeks.</w:t>
       </w:r>
     </w:p>
@@ -638,7 +620,7 @@
           <w:sz w:val="20"/>
           <w:szCs w:val="20"/>
         </w:rPr>
-        <w:t xml:space="preserve"> (TypeScript / Node, github.com/OJ-Uday/vetlock, Apache-2.0) — open-source npm supply-chain scanner: behavioral diff between two lockfiles, static analysis over extracted tarballs, 17 detectors (install-script injection, env-token harvest, exfil endpoints, obfuscation jumps, typosquat detection, GHSA correlation). Ships CLI, GitHub Action (SARIF), and a live in-browser demo backed by Cloudflare Workers + GitHub Actions. 375 tests; caught 12 of 13 real historical npm attacks; closed 31 of 35 exploits from a six-agent adversarial red-team review. NEVER-EXECUTE canary invariant.</w:t>
+        <w:t xml:space="preserve"> (TypeScript / Node, github.com/OJ-Uday/vetlock, Apache-2.0) — open-source npm supply-chain scanner: behavioral diff between two lockfiles, static analysis over extracted tarballs, 17 detectors (install-script injection, env-token harvest, exfil endpoints, obfuscation jumps, typosquat detection, GHSA correlation). Ships CLI, GitHub Action (SARIF), and a live in-browser demo backed by Cloudflare Workers + GitHub Actions. 375 tests; caught 12 of 13 real historical npm attacks. NEVER-EXECUTE canary invariant.</w:t>
       </w:r>
     </w:p>
     <w:p>

</xml_diff>